<commit_message>
Add the classifieds count to the housing-study newsletter
New section between the reliability critique and the two-problems section: seventeen weeks of help-wanted ads counted by hand, 172 jobs, about half printing a wage in the $45,000 to $65,000 range that matches federal payroll data and falls short of local housing costs, and 17 ads offering housing as part of the job with the share climbing from one in eleven in April to two in seven by mid-July. Closes on the point that every one of those jobs already exists, so the people who would fill them are the 182 rather than the 932. Now about 1,600 words across five pages.

Co-Authored-By: Claude Fable 5 <noreply@anthropic.com>
</commit_message>
<xml_diff>
--- a/Claude Files/Newsletters/The Number Everyone Quotes (DRAFT).docx
+++ b/Claude Files/Newsletters/The Number Everyone Quotes (DRAFT).docx
@@ -298,6 +298,135 @@
           <w:szCs w:val="23"/>
         </w:rPr>
         <w:t xml:space="preserve"> A need number with no price attached to it cannot tell you what to build. Our own community answered that question twice in the same year, and gave two completely opposite answers. When affordable homes went up for sale, six qualified households applied for every single one available. When new apartments came on the market at higher rents, barely more than one household applied per apartment, and five of them were still sitting empty in December. Demand here is not one number. It changes enormously depending on what you charge, and a study that produces a single figure cannot capture that.</w:t>
+      </w:r>
+    </w:p>
+    <w:p>
+      <w:pPr>
+        <w:spacing w:after="150" w:before="340"/>
+      </w:pPr>
+      <w:r>
+        <w:rPr>
+          <w:b/>
+          <w:bCs/>
+          <w:color w:val="1D5C63"/>
+          <w:sz w:val="27"/>
+          <w:szCs w:val="27"/>
+        </w:rPr>
+        <w:t xml:space="preserve">So I counted something myself</w:t>
+      </w:r>
+    </w:p>
+    <w:p>
+      <w:pPr>
+        <w:spacing w:after="200" w:line="320" w:lineRule="auto"/>
+      </w:pPr>
+      <w:r>
+        <w:rPr>
+          <w:color w:val="22303C"/>
+          <w:sz w:val="23"/>
+          <w:szCs w:val="23"/>
+        </w:rPr>
+        <w:t xml:space="preserve">Since nobody around here keeps track of any of this, I decided to count something that has been sitting in plain sight the whole time. Every week the Telluride Times prints a help wanted section. I went through seventeen straight weeks of them, from the beginning of April through the first week of August, and wrote down every single job.</w:t>
+      </w:r>
+    </w:p>
+    <w:p>
+      <w:pPr>
+        <w:spacing w:after="200" w:line="320" w:lineRule="auto"/>
+      </w:pPr>
+      <w:r>
+        <w:rPr>
+          <w:color w:val="22303C"/>
+          <w:sz w:val="23"/>
+          <w:szCs w:val="23"/>
+        </w:rPr>
+        <w:t xml:space="preserve">There were 172 of them. About half printed an actual wage, and most of those land somewhere between $45,000 and $65,000 a year. That is close to what the federal payroll figures say people here earn, which is reassuring in the sense that two completely different sources agree with each other, and discouraging in the sense that neither one comes anywhere near what it costs to live here.</w:t>
+      </w:r>
+    </w:p>
+    <w:p>
+      <w:pPr>
+        <w:spacing w:after="200" w:line="320" w:lineRule="auto"/>
+      </w:pPr>
+      <w:r>
+        <w:rPr>
+          <w:color w:val="22303C"/>
+          <w:sz w:val="23"/>
+          <w:szCs w:val="23"/>
+        </w:rPr>
+        <w:t xml:space="preserve">But the thing that stopped me was smaller and stranger than that. </w:t>
+      </w:r>
+      <w:r>
+        <w:rPr>
+          <w:b/>
+          <w:bCs/>
+          <w:color w:val="22303C"/>
+          <w:sz w:val="23"/>
+          <w:szCs w:val="23"/>
+        </w:rPr>
+        <w:t xml:space="preserve">Seventeen of those advertisements offered housing as part of the job.</w:t>
+      </w:r>
+      <w:r>
+        <w:rPr>
+          <w:color w:val="22303C"/>
+          <w:sz w:val="23"/>
+          <w:szCs w:val="23"/>
+        </w:rPr>
+        <w:t xml:space="preserve"> Not a signing bonus or a ski pass, but a place to live.</w:t>
+      </w:r>
+    </w:p>
+    <w:p>
+      <w:pPr>
+        <w:spacing w:after="200" w:line="320" w:lineRule="auto"/>
+      </w:pPr>
+      <w:r>
+        <w:rPr>
+          <w:color w:val="22303C"/>
+          <w:sz w:val="23"/>
+          <w:szCs w:val="23"/>
+        </w:rPr>
+        <w:t xml:space="preserve">And the number kept growing as the season went on. In April, roughly one advertisement in eleven mentioned housing. By the middle of July it was two in every seven. Employers here have started competing on housing the way they used to compete on wages, and they are paying for the advertisement that says so. One of them is San Miguel County itself, which mentioned housing in its posting for a Planning Director.</w:t>
+      </w:r>
+    </w:p>
+    <w:p>
+      <w:pPr>
+        <w:spacing w:after="200" w:line="320" w:lineRule="auto"/>
+      </w:pPr>
+      <w:r>
+        <w:rPr>
+          <w:color w:val="22303C"/>
+          <w:sz w:val="23"/>
+          <w:szCs w:val="23"/>
+        </w:rPr>
+        <w:t xml:space="preserve">Here is why that matters for the number everyone quotes. </w:t>
+      </w:r>
+      <w:r>
+        <w:rPr>
+          <w:b/>
+          <w:bCs/>
+          <w:color w:val="22303C"/>
+          <w:sz w:val="23"/>
+          <w:szCs w:val="23"/>
+        </w:rPr>
+        <w:t xml:space="preserve">Every one of those 172 jobs already exists.</w:t>
+      </w:r>
+      <w:r>
+        <w:rPr>
+          <w:color w:val="22303C"/>
+          <w:sz w:val="23"/>
+          <w:szCs w:val="23"/>
+        </w:rPr>
+        <w:t xml:space="preserve"> Somebody is already doing that work, or nobody is and a business is short-handed because of it. These are not jobs from a projection or a growth model. They are jobs on a page, printed on a Thursday, in a paper you can pick up at the market.</w:t>
+      </w:r>
+    </w:p>
+    <w:p>
+      <w:pPr>
+        <w:spacing w:after="200" w:line="320" w:lineRule="auto"/>
+      </w:pPr>
+      <w:r>
+        <w:rPr>
+          <w:color w:val="22303C"/>
+          <w:sz w:val="23"/>
+          <w:szCs w:val="23"/>
+        </w:rPr>
+        <w:t xml:space="preserve">The people who would fill them are the 182, not the 932.</w:t>
       </w:r>
     </w:p>
     <w:p>

</xml_diff>

<commit_message>
Correct the newsletter against the actual Housing Needs Analysis
Read the 337-page HNA and verified every claim. The 182 figure holds and is now precisely sourced as 110 units of overcrowding plus 72 households in temporary housing. Corrects an unfair criticism: the survey drew about 1,300 responses, not the ~340 renters previously stated, so the 'small sample' complaint is replaced with credit for the sample size while keeping the voluntary-response point. Replaces it with a stronger and better-sourced critique, that only 182 of 1,114 units are counted while 932 are modeled, including a 520-unit commuter figure built from three stacked assumptions (25% commuting chosen from a 21-28% range, 50% relocation preference, 1.43 employees per household). Adds the study's own category breakdown and a paragraph acknowledging that the 520 in-commuters work here today, which is a genuine question rather than a flaw.

Co-Authored-By: Claude Fable 5 <noreply@anthropic.com>
</commit_message>
<xml_diff>
--- a/Claude Files/Newsletters/The Number Everyone Quotes (DRAFT).docx
+++ b/Claude Files/Newsletters/The Number Everyone Quotes (DRAFT).docx
@@ -133,25 +133,74 @@
           <w:sz w:val="23"/>
           <w:szCs w:val="23"/>
         </w:rPr>
-        <w:t xml:space="preserve">The other 932 are something else. Some are homes for people who commute in from down valley and might move here if there were anywhere to move to. Some are for jobs that are open today and cannot be filled. And a large share are for jobs that </w:t>
-      </w:r>
-      <w:r>
-        <w:rPr>
-          <w:b/>
-          <w:bCs/>
-          <w:color w:val="22303C"/>
-          <w:sz w:val="23"/>
-          <w:szCs w:val="23"/>
-        </w:rPr>
-        <w:t xml:space="preserve">do not exist yet</w:t>
-      </w:r>
-      <w:r>
-        <w:rPr>
-          <w:color w:val="22303C"/>
-          <w:sz w:val="23"/>
-          <w:szCs w:val="23"/>
-        </w:rPr>
-        <w:t xml:space="preserve">, at businesses that have not opened, based on a projection of how much our economy is expected to grow.</w:t>
+        <w:t xml:space="preserve">The other 932 break down like this, using the study’s own categories. </w:t>
+      </w:r>
+      <w:r>
+        <w:rPr>
+          <w:b/>
+          <w:bCs/>
+          <w:color w:val="22303C"/>
+          <w:sz w:val="23"/>
+          <w:szCs w:val="23"/>
+        </w:rPr>
+        <w:t xml:space="preserve">520 are for people who commute in</w:t>
+      </w:r>
+      <w:r>
+        <w:rPr>
+          <w:color w:val="22303C"/>
+          <w:sz w:val="23"/>
+          <w:szCs w:val="23"/>
+        </w:rPr>
+        <w:t xml:space="preserve"> from down valley and might move here if they could afford to. </w:t>
+      </w:r>
+      <w:r>
+        <w:rPr>
+          <w:b/>
+          <w:bCs/>
+          <w:color w:val="22303C"/>
+          <w:sz w:val="23"/>
+          <w:szCs w:val="23"/>
+        </w:rPr>
+        <w:t xml:space="preserve">105 are for jobs that are open right now</w:t>
+      </w:r>
+      <w:r>
+        <w:rPr>
+          <w:color w:val="22303C"/>
+          <w:sz w:val="23"/>
+          <w:szCs w:val="23"/>
+        </w:rPr>
+        <w:t xml:space="preserve"> and cannot be filled. And </w:t>
+      </w:r>
+      <w:r>
+        <w:rPr>
+          <w:b/>
+          <w:bCs/>
+          <w:color w:val="22303C"/>
+          <w:sz w:val="23"/>
+          <w:szCs w:val="23"/>
+        </w:rPr>
+        <w:t xml:space="preserve">307 are for jobs that do not exist yet</w:t>
+      </w:r>
+      <w:r>
+        <w:rPr>
+          <w:color w:val="22303C"/>
+          <w:sz w:val="23"/>
+          <w:szCs w:val="23"/>
+        </w:rPr>
+        <w:t xml:space="preserve">, at businesses that have not opened, based on a projection of how much our economy is expected to grow over the next ten years.</w:t>
+      </w:r>
+    </w:p>
+    <w:p>
+      <w:pPr>
+        <w:spacing w:after="200" w:line="320" w:lineRule="auto"/>
+      </w:pPr>
+      <w:r>
+        <w:rPr>
+          <w:color w:val="22303C"/>
+          <w:sz w:val="23"/>
+          <w:szCs w:val="23"/>
+        </w:rPr>
+        <w:t xml:space="preserve">It is worth being fair about the middle group there. Those 520 commuters are not imaginary future people. They work here today. They drive in from Norwood and Placerville and Montrose, and many of them would move closer if there were anything to move into. Whether housing them counts as taking care of our own or as growing the community is a real question, and reasonable people land in different places on it. But it is a question, and burying it inside a single number means nobody ever gets asked.</w:t>
       </w:r>
     </w:p>
     <w:p>
@@ -220,15 +269,74 @@
           <w:sz w:val="23"/>
           <w:szCs w:val="23"/>
         </w:rPr>
-        <w:t xml:space="preserve">It leans on a small, voluntary survey.</w:t>
-      </w:r>
-      <w:r>
-        <w:rPr>
-          <w:color w:val="22303C"/>
-          <w:sz w:val="23"/>
-          <w:szCs w:val="23"/>
-        </w:rPr>
-        <w:t xml:space="preserve"> The rent figures behind the study come from a regional survey that about 340 renters filled out. That is not nothing, but it is a small group for an entire county, and more importantly nobody was randomly chosen. People volunteered. In a housing survey, the people most likely to sit down and answer questions about housing are the people having housing problems. That does not make their answers wrong. It does mean the results probably lean toward more need rather than less, and there is no way to measure by how much.</w:t>
+        <w:t xml:space="preserve">Only a small part of it was counted. The rest was modeled.</w:t>
+      </w:r>
+      <w:r>
+        <w:rPr>
+          <w:color w:val="22303C"/>
+          <w:sz w:val="23"/>
+          <w:szCs w:val="23"/>
+        </w:rPr>
+        <w:t xml:space="preserve"> This is the big one, and it took reading the whole study to see it. Of the 1,114 units, the study arrives at 182 by counting real things: 110 units of overcrowding measured from Census data, and 72 households the survey found living in temporary situations. Those are observations of people who exist.</w:t>
+      </w:r>
+    </w:p>
+    <w:p>
+      <w:pPr>
+        <w:spacing w:after="200" w:line="320" w:lineRule="auto"/>
+      </w:pPr>
+      <w:r>
+        <w:rPr>
+          <w:color w:val="22303C"/>
+          <w:sz w:val="23"/>
+          <w:szCs w:val="23"/>
+        </w:rPr>
+        <w:t xml:space="preserve">The other 932 are built out of assumptions, and the largest single piece of the whole number is a chain of three of them. To estimate housing for commuters, the study assumes 25 percent of workers commute in, a figure it chose from a range where one source said 21 percent, another said 23, and the employer survey said 28. Then it assumes half of those commuters would move here if they could, drawn from a survey question where 48 percent said they would prefer to. Then it converts people to households at 1.43 employees each. </w:t>
+      </w:r>
+      <w:r>
+        <w:rPr>
+          <w:b/>
+          <w:bCs/>
+          <w:color w:val="22303C"/>
+          <w:sz w:val="23"/>
+          <w:szCs w:val="23"/>
+        </w:rPr>
+        <w:t xml:space="preserve">Out the other end comes 520 housing units, which is nearly half of the entire 1,114.</w:t>
+      </w:r>
+    </w:p>
+    <w:p>
+      <w:pPr>
+        <w:spacing w:after="200" w:line="320" w:lineRule="auto"/>
+      </w:pPr>
+      <w:r>
+        <w:rPr>
+          <w:color w:val="22303C"/>
+          <w:sz w:val="23"/>
+          <w:szCs w:val="23"/>
+        </w:rPr>
+        <w:t xml:space="preserve">None of those assumptions is unreasonable, and the study states every one of them plainly, which is more than many do. But multiply three estimates together and small differences compound. Assume 21 percent commuting instead of 25, or 30 percent wanting to move instead of 50, and that 520 shrinks by hundreds. The number is not a measurement. It is a model, and models are only as good as the numbers you feed them.</w:t>
+      </w:r>
+    </w:p>
+    <w:p>
+      <w:pPr>
+        <w:spacing w:after="200" w:line="320" w:lineRule="auto"/>
+      </w:pPr>
+      <w:r>
+        <w:rPr>
+          <w:b/>
+          <w:bCs/>
+          <w:color w:val="22303C"/>
+          <w:sz w:val="23"/>
+          <w:szCs w:val="23"/>
+        </w:rPr>
+        <w:t xml:space="preserve">The survey behind it is better than I expected, but it is still voluntary.</w:t>
+      </w:r>
+      <w:r>
+        <w:rPr>
+          <w:color w:val="22303C"/>
+          <w:sz w:val="23"/>
+          <w:szCs w:val="23"/>
+        </w:rPr>
+        <w:t xml:space="preserve"> About 1,300 households responded, which is a genuinely respectable sample for a county this size, and I want to give the consultants credit for that. But nobody was randomly selected. People chose to answer. In a housing survey, the people most likely to sit down and fill out a form about housing are the people having housing trouble, which probably tilts the results toward more need rather than less. There is no way to measure by how much.</w:t>
       </w:r>
     </w:p>
     <w:p>

</xml_diff>